<commit_message>
Improve Chapter 1 content
Expanded theoretical background and explanations.
</commit_message>
<xml_diff>
--- a/Зертханалық жұмыс 2.docx
+++ b/Зертханалық жұмыс 2.docx
@@ -539,7 +539,17 @@
     <w:p>
       <w:pPr>
         <w:pStyle w:val="af0"/>
-      </w:pPr>
+        <w:jc w:val="center"/>
+        <w:rPr>
+          <w:sz w:val="24"/>
+        </w:rPr>
+      </w:pPr>
+      <w:r>
+        <w:rPr>
+          <w:sz w:val="24"/>
+        </w:rPr>
+        <w:t>Кесте 2.1 – Жүйенің функционалдық модульдері</w:t>
+      </w:r>
     </w:p>
     <w:tbl>
       <w:tblPr>
@@ -1114,21 +1124,6 @@
     <w:p>
       <w:pPr>
         <w:pStyle w:val="af0"/>
-        <w:jc w:val="center"/>
-        <w:rPr>
-          <w:sz w:val="24"/>
-        </w:rPr>
-      </w:pPr>
-      <w:r>
-        <w:rPr>
-          <w:sz w:val="24"/>
-        </w:rPr>
-        <w:t>Кесте 2.1 – Жүйенің функционалдық модульдері</w:t>
-      </w:r>
-    </w:p>
-    <w:p>
-      <w:pPr>
-        <w:pStyle w:val="af0"/>
         <w:ind w:firstLine="0"/>
         <w:rPr>
           <w:b/>
@@ -1372,7 +1367,6 @@
         <w:ind w:firstLine="709"/>
       </w:pPr>
       <w:r>
-        <w:lastRenderedPageBreak/>
         <w:t>Сипаттамалы статистика есептеу</w:t>
       </w:r>
     </w:p>
@@ -1401,6 +1395,7 @@
         <w:ind w:firstLine="709"/>
       </w:pPr>
       <w:r>
+        <w:lastRenderedPageBreak/>
         <w:t>Корреляция коэффициентін есептеу</w:t>
       </w:r>
     </w:p>
@@ -2046,13 +2041,7 @@
             <w:rPr>
               <w:rFonts w:ascii="Cambria Math" w:hAnsi="Cambria Math"/>
             </w:rPr>
-            <m:t>y = a + bx</m:t>
-          </m:r>
-          <m:r>
-            <w:rPr>
-              <w:rFonts w:ascii="Cambria Math" w:hAnsi="Cambria Math"/>
-            </w:rPr>
-            <m:t xml:space="preserve"> </m:t>
+            <m:t xml:space="preserve">y = a + bx </m:t>
           </m:r>
           <m:r>
             <w:rPr>
@@ -2545,13 +2534,7 @@
             <w:rPr>
               <w:rFonts w:ascii="Cambria Math" w:hAnsi="Cambria Math"/>
             </w:rPr>
-            <m:t>​</m:t>
-          </m:r>
-          <m:r>
-            <w:rPr>
-              <w:rFonts w:ascii="Cambria Math" w:hAnsi="Cambria Math"/>
-            </w:rPr>
-            <m:t xml:space="preserve"> </m:t>
+            <m:t xml:space="preserve">​ </m:t>
           </m:r>
           <m:r>
             <w:rPr>
@@ -9790,6 +9773,7 @@
   <w:style w:type="character" w:default="1" w:styleId="a0">
     <w:name w:val="Default Paragraph Font"/>
     <w:uiPriority w:val="1"/>
+    <w:semiHidden/>
     <w:unhideWhenUsed/>
   </w:style>
   <w:style w:type="table" w:default="1" w:styleId="a1">
@@ -10577,14 +10561,6 @@
 </file>
 
 <file path=customXml/item1.xml><?xml version="1.0" encoding="utf-8"?>
-<p:properties xmlns:p="http://schemas.microsoft.com/office/2006/metadata/properties" xmlns:xsi="http://www.w3.org/2001/XMLSchema-instance" xmlns:pc="http://schemas.microsoft.com/office/infopath/2007/PartnerControls">
-  <documentManagement>
-    <ReferenceId xmlns="8120d529-63bf-4934-a3f3-cbe26ec214d2" xsi:nil="true"/>
-  </documentManagement>
-</p:properties>
-</file>
-
-<file path=customXml/item2.xml><?xml version="1.0" encoding="utf-8"?>
 <ct:contentTypeSchema xmlns:ct="http://schemas.microsoft.com/office/2006/metadata/contentType" xmlns:ma="http://schemas.microsoft.com/office/2006/metadata/properties/metaAttributes" ct:_="" ma:_="" ma:contentTypeName="Документ" ma:contentTypeID="0x01010035D1E55C10FA9E4CA4C48E3426640D94" ma:contentTypeVersion="1" ma:contentTypeDescription="Создание документа." ma:contentTypeScope="" ma:versionID="8f8d65a84020098208e0200e4ef539c1">
   <xsd:schema xmlns:xsd="http://www.w3.org/2001/XMLSchema" xmlns:xs="http://www.w3.org/2001/XMLSchema" xmlns:p="http://schemas.microsoft.com/office/2006/metadata/properties" xmlns:ns2="8120d529-63bf-4934-a3f3-cbe26ec214d2" targetNamespace="http://schemas.microsoft.com/office/2006/metadata/properties" ma:root="true" ma:fieldsID="aaebba0ec5e58e77aa808b0759c12da5" ns2:_="">
     <xsd:import namespace="8120d529-63bf-4934-a3f3-cbe26ec214d2"/>
@@ -10710,11 +10686,15 @@
 </ct:contentTypeSchema>
 </file>
 
-<file path=customXml/item3.xml><?xml version="1.0" encoding="utf-8"?>
-<b:Sources xmlns:b="http://schemas.openxmlformats.org/officeDocument/2006/bibliography" xmlns="http://schemas.openxmlformats.org/officeDocument/2006/bibliography" SelectedStyle="\APASixthEditionOfficeOnline.xsl" StyleName="APA" Version="6"/>
+<file path=customXml/item2.xml><?xml version="1.0" encoding="utf-8"?>
+<p:properties xmlns:p="http://schemas.microsoft.com/office/2006/metadata/properties" xmlns:xsi="http://www.w3.org/2001/XMLSchema-instance" xmlns:pc="http://schemas.microsoft.com/office/infopath/2007/PartnerControls">
+  <documentManagement>
+    <ReferenceId xmlns="8120d529-63bf-4934-a3f3-cbe26ec214d2" xsi:nil="true"/>
+  </documentManagement>
+</p:properties>
 </file>
 
-<file path=customXml/item4.xml><?xml version="1.0" encoding="utf-8"?>
+<file path=customXml/item3.xml><?xml version="1.0" encoding="utf-8"?>
 <?mso-contentType ?>
 <FormTemplates xmlns="http://schemas.microsoft.com/sharepoint/v3/contenttype/forms">
   <Display>DocumentLibraryForm</Display>
@@ -10723,17 +10703,11 @@
 </FormTemplates>
 </file>
 
-<file path=customXml/itemProps1.xml><?xml version="1.0" encoding="utf-8"?>
-<ds:datastoreItem xmlns:ds="http://schemas.openxmlformats.org/officeDocument/2006/customXml" ds:itemID="{1F294B49-D2A4-41CB-BC16-00843B459586}">
-  <ds:schemaRefs>
-    <ds:schemaRef ds:uri="http://schemas.microsoft.com/office/2006/metadata/properties"/>
-    <ds:schemaRef ds:uri="http://schemas.microsoft.com/office/infopath/2007/PartnerControls"/>
-    <ds:schemaRef ds:uri="8120d529-63bf-4934-a3f3-cbe26ec214d2"/>
-  </ds:schemaRefs>
-</ds:datastoreItem>
+<file path=customXml/item4.xml><?xml version="1.0" encoding="utf-8"?>
+<b:Sources xmlns:b="http://schemas.openxmlformats.org/officeDocument/2006/bibliography" xmlns="http://schemas.openxmlformats.org/officeDocument/2006/bibliography" SelectedStyle="\APASixthEditionOfficeOnline.xsl" StyleName="APA" Version="6"/>
 </file>
 
-<file path=customXml/itemProps2.xml><?xml version="1.0" encoding="utf-8"?>
+<file path=customXml/itemProps1.xml><?xml version="1.0" encoding="utf-8"?>
 <ds:datastoreItem xmlns:ds="http://schemas.openxmlformats.org/officeDocument/2006/customXml" ds:itemID="{EEE2192C-E1E2-44D2-988E-A42D41804130}">
   <ds:schemaRefs>
     <ds:schemaRef ds:uri="http://schemas.microsoft.com/office/2006/metadata/contentType"/>
@@ -10751,18 +10725,28 @@
 </ds:datastoreItem>
 </file>
 
+<file path=customXml/itemProps2.xml><?xml version="1.0" encoding="utf-8"?>
+<ds:datastoreItem xmlns:ds="http://schemas.openxmlformats.org/officeDocument/2006/customXml" ds:itemID="{1F294B49-D2A4-41CB-BC16-00843B459586}">
+  <ds:schemaRefs>
+    <ds:schemaRef ds:uri="http://schemas.microsoft.com/office/2006/metadata/properties"/>
+    <ds:schemaRef ds:uri="http://schemas.microsoft.com/office/infopath/2007/PartnerControls"/>
+    <ds:schemaRef ds:uri="8120d529-63bf-4934-a3f3-cbe26ec214d2"/>
+  </ds:schemaRefs>
+</ds:datastoreItem>
+</file>
+
 <file path=customXml/itemProps3.xml><?xml version="1.0" encoding="utf-8"?>
+<ds:datastoreItem xmlns:ds="http://schemas.openxmlformats.org/officeDocument/2006/customXml" ds:itemID="{68DEBE4C-3C0C-4B09-AEB1-0CFE33A4FB4A}">
+  <ds:schemaRefs>
+    <ds:schemaRef ds:uri="http://schemas.microsoft.com/sharepoint/v3/contenttype/forms"/>
+  </ds:schemaRefs>
+</ds:datastoreItem>
+</file>
+
+<file path=customXml/itemProps4.xml><?xml version="1.0" encoding="utf-8"?>
 <ds:datastoreItem xmlns:ds="http://schemas.openxmlformats.org/officeDocument/2006/customXml" ds:itemID="{07DD1FC5-572A-431E-9C26-3DF0E34477EC}">
   <ds:schemaRefs>
     <ds:schemaRef ds:uri="http://schemas.openxmlformats.org/officeDocument/2006/bibliography"/>
   </ds:schemaRefs>
 </ds:datastoreItem>
-</file>
-
-<file path=customXml/itemProps4.xml><?xml version="1.0" encoding="utf-8"?>
-<ds:datastoreItem xmlns:ds="http://schemas.openxmlformats.org/officeDocument/2006/customXml" ds:itemID="{68DEBE4C-3C0C-4B09-AEB1-0CFE33A4FB4A}">
-  <ds:schemaRefs>
-    <ds:schemaRef ds:uri="http://schemas.microsoft.com/sharepoint/v3/contenttype/forms"/>
-  </ds:schemaRefs>
-</ds:datastoreItem>
 </file>
</xml_diff>